<commit_message>
Add run_all.sh, README, requirements, submission checklist; record main results
Co-Authored-By: Claude Opus 5.5 <noreply@anthropic.com>
Claude-Session: https://claude.ai/code/session_016n4FdkJhh6GyuBxjTAwoWb
</commit_message>
<xml_diff>
--- a/paper/manuscript.docx
+++ b/paper/manuscript.docx
@@ -4972,7 +4972,7 @@
         <w:t xml:space="preserve"> </w:t>
       </w:r>
       <w:r>
-        <w:t xml:space="preserve">the relative RMSEs range from 0.98 (ML combination) and 0.99 (random forest) to 1.05 (ridge). The lowest one-sided Diebold–Mariano p-value across all seven challengers and four decisive cases is 0.32, far from any conventional threshold; after the Holm correction, the smallest is 1.00. Twelve months ahead the picture is the same: the ratios lie between 1.00 and 1.07. For inflation accumulated over the next three months, the combination and the random forest are about 2% more accurate than the AR (0.98 and 0.99), but for inflation over the next year they are worse (1.03 and 1.04). The model confidence set confirms that these differences are noise. The 90% set contains the AR in every case, together with almost every challenger. The models excluded are: Random walk, Random walk, 12-month mean at h = 1; Random walk, Gradient boosting at h = 12; Random walk at 3-month acc.; Random walk at 12-month acc..</w:t>
+        <w:t xml:space="preserve">the relative RMSEs range from 0.98 (ML combination) and 0.99 (random forest) to 1.05 (ridge). The lowest one-sided Diebold–Mariano p-value across all seven challengers and four decisive cases is 0.32, far from any conventional threshold; after the Holm correction, the smallest is 1.00. Twelve months ahead the picture is the same: the ratios lie between 1.00 and 1.07. For inflation accumulated over the next three months, the combination and the random forest are about 2% more accurate than the AR (0.98 and 0.99), but for inflation over the next year they are worse (1.03 and 1.04). The model confidence set confirms that these differences are noise. The 90% set contains the AR in every case, together with almost every challenger. The models excluded are: Random walk and Random walk (12-month mean) at h = 1; Random walk and Gradient boosting at h = 12; Random walk at 3-month acc.; Random walk at 12-month acc..</w:t>
       </w:r>
     </w:p>
     <w:p>
@@ -5145,7 +5145,7 @@
               <w:jc w:val="left"/>
             </w:pPr>
             <w:r>
-              <w:t xml:space="preserve">Random walk, 12-month mean</w:t>
+              <w:t xml:space="preserve">Random walk (12-month mean)</w:t>
             </w:r>
           </w:p>
         </w:tc>
@@ -5789,31 +5789,31 @@
               <w:jc w:val="left"/>
             </w:pPr>
             <w:r>
-              <w:t xml:space="preserve">Random walk, 12-month mean, AR, Factor (AR + PCs), Ridge, LASSO, Adaptive LASSO, Random forest, ML combination</w:t>
-            </w:r>
-          </w:p>
-        </w:tc>
-        <w:tc>
-          <w:tcPr/>
-          <w:p>
-            <w:pPr>
-              <w:pStyle w:val="Compact"/>
-              <w:jc w:val="left"/>
-            </w:pPr>
-            <w:r>
-              <w:t xml:space="preserve">Random walk, 12-month mean, AR, Factor (AR + PCs), Ridge, LASSO, Adaptive LASSO, Random forest, Gradient boosting, ML combination</w:t>
-            </w:r>
-          </w:p>
-        </w:tc>
-        <w:tc>
-          <w:tcPr/>
-          <w:p>
-            <w:pPr>
-              <w:pStyle w:val="Compact"/>
-              <w:jc w:val="left"/>
-            </w:pPr>
-            <w:r>
-              <w:t xml:space="preserve">Random walk, 12-month mean, AR, Factor (AR + PCs), Ridge, LASSO, Adaptive LASSO, Random forest, Gradient boosting, ML combination</w:t>
+              <w:t xml:space="preserve">Random walk (12-month mean), AR, Factor (AR + PCs), Ridge, LASSO, Adaptive LASSO, Random forest, ML combination</w:t>
+            </w:r>
+          </w:p>
+        </w:tc>
+        <w:tc>
+          <w:tcPr/>
+          <w:p>
+            <w:pPr>
+              <w:pStyle w:val="Compact"/>
+              <w:jc w:val="left"/>
+            </w:pPr>
+            <w:r>
+              <w:t xml:space="preserve">Random walk (12-month mean), AR, Factor (AR + PCs), Ridge, LASSO, Adaptive LASSO, Random forest, Gradient boosting, ML combination</w:t>
+            </w:r>
+          </w:p>
+        </w:tc>
+        <w:tc>
+          <w:tcPr/>
+          <w:p>
+            <w:pPr>
+              <w:pStyle w:val="Compact"/>
+              <w:jc w:val="left"/>
+            </w:pPr>
+            <w:r>
+              <w:t xml:space="preserve">Random walk (12-month mean), AR, Factor (AR + PCs), Ridge, LASSO, Adaptive LASSO, Random forest, Gradient boosting, ML combination</w:t>
             </w:r>
           </w:p>
         </w:tc>
@@ -9290,7 +9290,7 @@
               <w:jc w:val="left"/>
             </w:pPr>
             <w:r>
-              <w:t xml:space="preserve">Random walk, 12-month mean</w:t>
+              <w:t xml:space="preserve">Random walk (12-month mean)</w:t>
             </w:r>
           </w:p>
         </w:tc>

</xml_diff>

<commit_message>
Robustness write-up for six checks, figure fixes, re-rendered manuscript
Co-Authored-By: Claude Opus 5.5 <noreply@anthropic.com>
Claude-Session: https://claude.ai/code/session_016n4FdkJhh6GyuBxjTAwoWb
</commit_message>
<xml_diff>
--- a/paper/manuscript.docx
+++ b/paper/manuscript.docx
@@ -155,7 +155,7 @@
         <w:t xml:space="preserve"> </w:t>
       </w:r>
       <w:r>
-        <w:t xml:space="preserve">15</w:t>
+        <w:t xml:space="preserve">16</w:t>
       </w:r>
       <w:r>
         <w:t xml:space="preserve"> </w:t>
@@ -5870,7 +5870,7 @@
         <w:pStyle w:val="FirstParagraph"/>
       </w:pPr>
       <w:r>
-        <w:t xml:space="preserve">Figure 4 shows which predictor groups the random forest relies on. One month ahead, food prices carry 26% of the grouped permutation importance, regional inflation 23% and the other domestic CPI components 23%. World prices (9%), energy and utilities (5%) and money and the exchange rate (4%) matter much less. The LASSO tells the same story: it selects at least one food feature at 71% of origins and one regional feature at 72%, against 33% for world prices. Twelve months ahead, the random forest shifts toward the slow-moving domestic components (50%), and the LASSO selects almost nothing; the share of origins with any food feature falls to 14%.</w:t>
+        <w:t xml:space="preserve">Figure 4 shows which predictor groups the random forest relies on. One month ahead, food prices carry 26% of the grouped permutation importance, regional inflation 23% and the other domestic CPI components 23%. World prices (9%), energy and utilities (5%) and money and the exchange rate (4%) matter much less. The LASSO tells the same story: it selects at least one food feature at 71% of origins and one regional feature at 72%, against 33% for world prices. Twelve months ahead, the random forest shifts toward the slow-moving domestic components (50%), and the LASSO selects far fewer features: the share of origins with any food feature falls to 14%, and with any other domestic feature to 30%.</w:t>
       </w:r>
     </w:p>
     <w:p>
@@ -5904,7 +5904,7 @@
         <w:pStyle w:val="BodyText"/>
       </w:pPr>
       <w:r>
-        <w:t xml:space="preserve">Figure 3 tracks the comparison over time. A rising line means the model is gaining on the AR. One month ahead, the random forest and the combination gain slowly from 2010 to 2020, lose that lead in the 2021–23 surge, and then swing sharply in the 2026 oil shock. No model saw the March–April 2026 jump coming (monthly inflation of 1.36% and 2.60%). But the AR then carried the April jump forward, forecasting 1.48% for May, when prices in fact fell (-0.51%). The ML models, which average over many predictors, gave a damped 0.62%. Twelve months ahead, the ML models lose ground in the 2022–23 surge and do not recover it. Figure 7 shows why accuracy is so hard to come by at this horizon. Both the AR and the ML combination forecast year-ahead inflation close to its recent average, between about 3% and 5%, and neither anticipates the 2008, 2018, 2022–23 or 2026 episodes.</w:t>
+        <w:t xml:space="preserve">Figure 3 tracks the comparison over time. A rising line means the model is gaining on the AR. One month ahead, the random forest and the combination gain a little on the AR before 2008 and again in 2010–12, hold that small lead until 2020, lose it in the 2021–23 surge, and then swing sharply in the 2026 oil shock. No model saw the March–April 2026 jump coming (monthly inflation of 1.36% and 2.60%). But the AR then carried the April jump forward, forecasting 1.48% for May, when prices in fact fell (-0.51%). The ML models, which average over many predictors, gave a damped 0.62%. Twelve months ahead, the ML models lose ground in the 2022–23 surge and do not recover it. Figure 7 shows why accuracy is so hard to come by at this horizon. Both the AR and the ML combination forecast year-ahead inflation close to its recent average, mostly between about 3% and 5%, and neither anticipates the 2008, 2018, 2022–23 or 2026 episodes.</w:t>
       </w:r>
     </w:p>
     <w:p>
@@ -7075,7 +7075,15 @@
         <w:pStyle w:val="FirstParagraph"/>
       </w:pPr>
       <w:r>
-        <w:t xml:space="preserve">Figure 5 and Table A4 report the four decisive cases under each pre-registered robustness check. With targets up to December 2019 only, the lowest relative RMSE among the challengers is 0.97 (Factor (AR + PCs), h = 1), and 0 of 28 Diebold–Mariano tests against the AR reject at 5%.</w:t>
+        <w:t xml:space="preserve">Figure 5 and Table A4 report the four decisive cases under each pre-registered robustness check. The checks are: a 96-month window; a 180-month window; targets up to December 2019 only; only world prices and money as predictors; a dummy for the January 2018 join; core inflation as the target. Across these 6 checks, the lowest relative RMSE among the challengers ranges from 0.94 to 0.98, and none of the 168 Diebold–Mariano tests against the AR reject at 5%. Taken together, the checks leave the conclusion unchanged. For headline inflation, the best model in each check is at most about 3% more accurate than the AR, the same small and insignificant margin as in the main specification. A shorter (96-month) or longer (180-month) window does not help the data-rich models: more data per window does not turn the small gains into significant ones. Leaving out the pandemic and the 2022–23 surge (targets up to December 2019) does not change the picture either, so the null result is not an artefact of recent shocks. Using only world prices and money as predictors makes gradient boosting and the random forest worse at the one-year horizon (1.20 and 1.07), which confirms that the world-price block on its own adds noise. The January 2018 join dummy changes nothing.</w:t>
+      </w:r>
+    </w:p>
+    <w:p>
+      <w:pPr>
+        <w:pStyle w:val="BodyText"/>
+      </w:pPr>
+      <w:r>
+        <w:t xml:space="preserve">The one partial exception is core inflation, which excludes the most volatile food and energy items. With core inflation as the target, the random forest and the ML combination have relative RMSEs of 0.95 and 0.95 one month ahead, and the combination reaches 0.94 for inflation over the next three months (one-sided DM p = 0.061). This is significant only at the 10% level, and not after the Holm correction (p = 1.000). We read it as weak evidence that the ML models find some signal once the hardest-to-predict supply shocks are removed from the target. That fits the explanation in Section 7: the obstacle is the unpredictability of food and energy shocks, not a lack of model flexibility.</w:t>
       </w:r>
     </w:p>
     <w:bookmarkEnd w:id="31"/>
@@ -11113,7 +11121,7 @@
               <w:jc w:val="left"/>
             </w:pPr>
             <w:r>
-              <w:t xml:space="preserve">Targets up to december 2019 only</w:t>
+              <w:t xml:space="preserve">A 96-month window</w:t>
             </w:r>
           </w:p>
         </w:tc>
@@ -11137,18 +11145,6 @@
               <w:jc w:val="left"/>
             </w:pPr>
             <w:r>
-              <w:t xml:space="preserve">0.97</w:t>
-            </w:r>
-          </w:p>
-        </w:tc>
-        <w:tc>
-          <w:tcPr/>
-          <w:p>
-            <w:pPr>
-              <w:pStyle w:val="Compact"/>
-              <w:jc w:val="left"/>
-            </w:pPr>
-            <w:r>
               <w:t xml:space="preserve">1.00</w:t>
             </w:r>
           </w:p>
@@ -11161,19 +11157,31 @@
               <w:jc w:val="left"/>
             </w:pPr>
             <w:r>
-              <w:t xml:space="preserve">0.98</w:t>
-            </w:r>
-          </w:p>
-        </w:tc>
-        <w:tc>
-          <w:tcPr/>
-          <w:p>
-            <w:pPr>
-              <w:pStyle w:val="Compact"/>
-              <w:jc w:val="left"/>
-            </w:pPr>
-            <w:r>
               <w:t xml:space="preserve">1.01</w:t>
+            </w:r>
+          </w:p>
+        </w:tc>
+        <w:tc>
+          <w:tcPr/>
+          <w:p>
+            <w:pPr>
+              <w:pStyle w:val="Compact"/>
+              <w:jc w:val="left"/>
+            </w:pPr>
+            <w:r>
+              <w:t xml:space="preserve">1.00</w:t>
+            </w:r>
+          </w:p>
+        </w:tc>
+        <w:tc>
+          <w:tcPr/>
+          <w:p>
+            <w:pPr>
+              <w:pStyle w:val="Compact"/>
+              <w:jc w:val="left"/>
+            </w:pPr>
+            <w:r>
+              <w:t xml:space="preserve">1.03</w:t>
             </w:r>
           </w:p>
         </w:tc>
@@ -11187,7 +11195,7 @@
               <w:jc w:val="left"/>
             </w:pPr>
             <w:r>
-              <w:t xml:space="preserve">Targets up to december 2019 only</w:t>
+              <w:t xml:space="preserve">A 96-month window</w:t>
             </w:r>
           </w:p>
         </w:tc>
@@ -11211,7 +11219,31 @@
               <w:jc w:val="left"/>
             </w:pPr>
             <w:r>
-              <w:t xml:space="preserve">1.03</w:t>
+              <w:t xml:space="preserve">1.01</w:t>
+            </w:r>
+          </w:p>
+        </w:tc>
+        <w:tc>
+          <w:tcPr/>
+          <w:p>
+            <w:pPr>
+              <w:pStyle w:val="Compact"/>
+              <w:jc w:val="left"/>
+            </w:pPr>
+            <w:r>
+              <w:t xml:space="preserve">1.00</w:t>
+            </w:r>
+          </w:p>
+        </w:tc>
+        <w:tc>
+          <w:tcPr/>
+          <w:p>
+            <w:pPr>
+              <w:pStyle w:val="Compact"/>
+              <w:jc w:val="left"/>
+            </w:pPr>
+            <w:r>
+              <w:t xml:space="preserve">1.00</w:t>
             </w:r>
           </w:p>
         </w:tc>
@@ -11224,30 +11256,6 @@
             </w:pPr>
             <w:r>
               <w:t xml:space="preserve">0.99</w:t>
-            </w:r>
-          </w:p>
-        </w:tc>
-        <w:tc>
-          <w:tcPr/>
-          <w:p>
-            <w:pPr>
-              <w:pStyle w:val="Compact"/>
-              <w:jc w:val="left"/>
-            </w:pPr>
-            <w:r>
-              <w:t xml:space="preserve">1.03</w:t>
-            </w:r>
-          </w:p>
-        </w:tc>
-        <w:tc>
-          <w:tcPr/>
-          <w:p>
-            <w:pPr>
-              <w:pStyle w:val="Compact"/>
-              <w:jc w:val="left"/>
-            </w:pPr>
-            <w:r>
-              <w:t xml:space="preserve">1.03</w:t>
             </w:r>
           </w:p>
         </w:tc>
@@ -11261,7 +11269,7 @@
               <w:jc w:val="left"/>
             </w:pPr>
             <w:r>
-              <w:t xml:space="preserve">Targets up to december 2019 only</w:t>
+              <w:t xml:space="preserve">A 96-month window</w:t>
             </w:r>
           </w:p>
         </w:tc>
@@ -11285,6 +11293,30 @@
               <w:jc w:val="left"/>
             </w:pPr>
             <w:r>
+              <w:t xml:space="preserve">1.00</w:t>
+            </w:r>
+          </w:p>
+        </w:tc>
+        <w:tc>
+          <w:tcPr/>
+          <w:p>
+            <w:pPr>
+              <w:pStyle w:val="Compact"/>
+              <w:jc w:val="left"/>
+            </w:pPr>
+            <w:r>
+              <w:t xml:space="preserve">1.01</w:t>
+            </w:r>
+          </w:p>
+        </w:tc>
+        <w:tc>
+          <w:tcPr/>
+          <w:p>
+            <w:pPr>
+              <w:pStyle w:val="Compact"/>
+              <w:jc w:val="left"/>
+            </w:pPr>
+            <w:r>
               <w:t xml:space="preserve">0.98</w:t>
             </w:r>
           </w:p>
@@ -11297,31 +11329,7 @@
               <w:jc w:val="left"/>
             </w:pPr>
             <w:r>
-              <w:t xml:space="preserve">0.98</w:t>
-            </w:r>
-          </w:p>
-        </w:tc>
-        <w:tc>
-          <w:tcPr/>
-          <w:p>
-            <w:pPr>
-              <w:pStyle w:val="Compact"/>
-              <w:jc w:val="left"/>
-            </w:pPr>
-            <w:r>
-              <w:t xml:space="preserve">1.00</w:t>
-            </w:r>
-          </w:p>
-        </w:tc>
-        <w:tc>
-          <w:tcPr/>
-          <w:p>
-            <w:pPr>
-              <w:pStyle w:val="Compact"/>
-              <w:jc w:val="left"/>
-            </w:pPr>
-            <w:r>
-              <w:t xml:space="preserve">1.09</w:t>
+              <w:t xml:space="preserve">1.01</w:t>
             </w:r>
           </w:p>
         </w:tc>
@@ -11335,6 +11343,376 @@
               <w:jc w:val="left"/>
             </w:pPr>
             <w:r>
+              <w:t xml:space="preserve">A 96-month window</w:t>
+            </w:r>
+          </w:p>
+        </w:tc>
+        <w:tc>
+          <w:tcPr/>
+          <w:p>
+            <w:pPr>
+              <w:pStyle w:val="Compact"/>
+              <w:jc w:val="left"/>
+            </w:pPr>
+            <w:r>
+              <w:t xml:space="preserve">ML combination</w:t>
+            </w:r>
+          </w:p>
+        </w:tc>
+        <w:tc>
+          <w:tcPr/>
+          <w:p>
+            <w:pPr>
+              <w:pStyle w:val="Compact"/>
+              <w:jc w:val="left"/>
+            </w:pPr>
+            <w:r>
+              <w:t xml:space="preserve">0.99</w:t>
+            </w:r>
+          </w:p>
+        </w:tc>
+        <w:tc>
+          <w:tcPr/>
+          <w:p>
+            <w:pPr>
+              <w:pStyle w:val="Compact"/>
+              <w:jc w:val="left"/>
+            </w:pPr>
+            <w:r>
+              <w:t xml:space="preserve">1.01</w:t>
+            </w:r>
+          </w:p>
+        </w:tc>
+        <w:tc>
+          <w:tcPr/>
+          <w:p>
+            <w:pPr>
+              <w:pStyle w:val="Compact"/>
+              <w:jc w:val="left"/>
+            </w:pPr>
+            <w:r>
+              <w:t xml:space="preserve">0.98</w:t>
+            </w:r>
+          </w:p>
+        </w:tc>
+        <w:tc>
+          <w:tcPr/>
+          <w:p>
+            <w:pPr>
+              <w:pStyle w:val="Compact"/>
+              <w:jc w:val="left"/>
+            </w:pPr>
+            <w:r>
+              <w:t xml:space="preserve">1.00</w:t>
+            </w:r>
+          </w:p>
+        </w:tc>
+      </w:tr>
+      <w:tr>
+        <w:tc>
+          <w:tcPr/>
+          <w:p>
+            <w:pPr>
+              <w:pStyle w:val="Compact"/>
+              <w:jc w:val="left"/>
+            </w:pPr>
+            <w:r>
+              <w:t xml:space="preserve">A 180-month window</w:t>
+            </w:r>
+          </w:p>
+        </w:tc>
+        <w:tc>
+          <w:tcPr/>
+          <w:p>
+            <w:pPr>
+              <w:pStyle w:val="Compact"/>
+              <w:jc w:val="left"/>
+            </w:pPr>
+            <w:r>
+              <w:t xml:space="preserve">Factor (AR + PCs)</w:t>
+            </w:r>
+          </w:p>
+        </w:tc>
+        <w:tc>
+          <w:tcPr/>
+          <w:p>
+            <w:pPr>
+              <w:pStyle w:val="Compact"/>
+              <w:jc w:val="left"/>
+            </w:pPr>
+            <w:r>
+              <w:t xml:space="preserve">1.01</w:t>
+            </w:r>
+          </w:p>
+        </w:tc>
+        <w:tc>
+          <w:tcPr/>
+          <w:p>
+            <w:pPr>
+              <w:pStyle w:val="Compact"/>
+              <w:jc w:val="left"/>
+            </w:pPr>
+            <w:r>
+              <w:t xml:space="preserve">1.00</w:t>
+            </w:r>
+          </w:p>
+        </w:tc>
+        <w:tc>
+          <w:tcPr/>
+          <w:p>
+            <w:pPr>
+              <w:pStyle w:val="Compact"/>
+              <w:jc w:val="left"/>
+            </w:pPr>
+            <w:r>
+              <w:t xml:space="preserve">1.01</w:t>
+            </w:r>
+          </w:p>
+        </w:tc>
+        <w:tc>
+          <w:tcPr/>
+          <w:p>
+            <w:pPr>
+              <w:pStyle w:val="Compact"/>
+              <w:jc w:val="left"/>
+            </w:pPr>
+            <w:r>
+              <w:t xml:space="preserve">1.00</w:t>
+            </w:r>
+          </w:p>
+        </w:tc>
+      </w:tr>
+      <w:tr>
+        <w:tc>
+          <w:tcPr/>
+          <w:p>
+            <w:pPr>
+              <w:pStyle w:val="Compact"/>
+              <w:jc w:val="left"/>
+            </w:pPr>
+            <w:r>
+              <w:t xml:space="preserve">A 180-month window</w:t>
+            </w:r>
+          </w:p>
+        </w:tc>
+        <w:tc>
+          <w:tcPr/>
+          <w:p>
+            <w:pPr>
+              <w:pStyle w:val="Compact"/>
+              <w:jc w:val="left"/>
+            </w:pPr>
+            <w:r>
+              <w:t xml:space="preserve">LASSO</w:t>
+            </w:r>
+          </w:p>
+        </w:tc>
+        <w:tc>
+          <w:tcPr/>
+          <w:p>
+            <w:pPr>
+              <w:pStyle w:val="Compact"/>
+              <w:jc w:val="left"/>
+            </w:pPr>
+            <w:r>
+              <w:t xml:space="preserve">1.00</w:t>
+            </w:r>
+          </w:p>
+        </w:tc>
+        <w:tc>
+          <w:tcPr/>
+          <w:p>
+            <w:pPr>
+              <w:pStyle w:val="Compact"/>
+              <w:jc w:val="left"/>
+            </w:pPr>
+            <w:r>
+              <w:t xml:space="preserve">1.00</w:t>
+            </w:r>
+          </w:p>
+        </w:tc>
+        <w:tc>
+          <w:tcPr/>
+          <w:p>
+            <w:pPr>
+              <w:pStyle w:val="Compact"/>
+              <w:jc w:val="left"/>
+            </w:pPr>
+            <w:r>
+              <w:t xml:space="preserve">1.01</w:t>
+            </w:r>
+          </w:p>
+        </w:tc>
+        <w:tc>
+          <w:tcPr/>
+          <w:p>
+            <w:pPr>
+              <w:pStyle w:val="Compact"/>
+              <w:jc w:val="left"/>
+            </w:pPr>
+            <w:r>
+              <w:t xml:space="preserve">1.01</w:t>
+            </w:r>
+          </w:p>
+        </w:tc>
+      </w:tr>
+      <w:tr>
+        <w:tc>
+          <w:tcPr/>
+          <w:p>
+            <w:pPr>
+              <w:pStyle w:val="Compact"/>
+              <w:jc w:val="left"/>
+            </w:pPr>
+            <w:r>
+              <w:t xml:space="preserve">A 180-month window</w:t>
+            </w:r>
+          </w:p>
+        </w:tc>
+        <w:tc>
+          <w:tcPr/>
+          <w:p>
+            <w:pPr>
+              <w:pStyle w:val="Compact"/>
+              <w:jc w:val="left"/>
+            </w:pPr>
+            <w:r>
+              <w:t xml:space="preserve">Random forest</w:t>
+            </w:r>
+          </w:p>
+        </w:tc>
+        <w:tc>
+          <w:tcPr/>
+          <w:p>
+            <w:pPr>
+              <w:pStyle w:val="Compact"/>
+              <w:jc w:val="left"/>
+            </w:pPr>
+            <w:r>
+              <w:t xml:space="preserve">0.99</w:t>
+            </w:r>
+          </w:p>
+        </w:tc>
+        <w:tc>
+          <w:tcPr/>
+          <w:p>
+            <w:pPr>
+              <w:pStyle w:val="Compact"/>
+              <w:jc w:val="left"/>
+            </w:pPr>
+            <w:r>
+              <w:t xml:space="preserve">0.99</w:t>
+            </w:r>
+          </w:p>
+        </w:tc>
+        <w:tc>
+          <w:tcPr/>
+          <w:p>
+            <w:pPr>
+              <w:pStyle w:val="Compact"/>
+              <w:jc w:val="left"/>
+            </w:pPr>
+            <w:r>
+              <w:t xml:space="preserve">0.99</w:t>
+            </w:r>
+          </w:p>
+        </w:tc>
+        <w:tc>
+          <w:tcPr/>
+          <w:p>
+            <w:pPr>
+              <w:pStyle w:val="Compact"/>
+              <w:jc w:val="left"/>
+            </w:pPr>
+            <w:r>
+              <w:t xml:space="preserve">1.03</w:t>
+            </w:r>
+          </w:p>
+        </w:tc>
+      </w:tr>
+      <w:tr>
+        <w:tc>
+          <w:tcPr/>
+          <w:p>
+            <w:pPr>
+              <w:pStyle w:val="Compact"/>
+              <w:jc w:val="left"/>
+            </w:pPr>
+            <w:r>
+              <w:t xml:space="preserve">A 180-month window</w:t>
+            </w:r>
+          </w:p>
+        </w:tc>
+        <w:tc>
+          <w:tcPr/>
+          <w:p>
+            <w:pPr>
+              <w:pStyle w:val="Compact"/>
+              <w:jc w:val="left"/>
+            </w:pPr>
+            <w:r>
+              <w:t xml:space="preserve">ML combination</w:t>
+            </w:r>
+          </w:p>
+        </w:tc>
+        <w:tc>
+          <w:tcPr/>
+          <w:p>
+            <w:pPr>
+              <w:pStyle w:val="Compact"/>
+              <w:jc w:val="left"/>
+            </w:pPr>
+            <w:r>
+              <w:t xml:space="preserve">0.97</w:t>
+            </w:r>
+          </w:p>
+        </w:tc>
+        <w:tc>
+          <w:tcPr/>
+          <w:p>
+            <w:pPr>
+              <w:pStyle w:val="Compact"/>
+              <w:jc w:val="left"/>
+            </w:pPr>
+            <w:r>
+              <w:t xml:space="preserve">1.00</w:t>
+            </w:r>
+          </w:p>
+        </w:tc>
+        <w:tc>
+          <w:tcPr/>
+          <w:p>
+            <w:pPr>
+              <w:pStyle w:val="Compact"/>
+              <w:jc w:val="left"/>
+            </w:pPr>
+            <w:r>
+              <w:t xml:space="preserve">0.99</w:t>
+            </w:r>
+          </w:p>
+        </w:tc>
+        <w:tc>
+          <w:tcPr/>
+          <w:p>
+            <w:pPr>
+              <w:pStyle w:val="Compact"/>
+              <w:jc w:val="left"/>
+            </w:pPr>
+            <w:r>
+              <w:t xml:space="preserve">1.01</w:t>
+            </w:r>
+          </w:p>
+        </w:tc>
+      </w:tr>
+      <w:tr>
+        <w:tc>
+          <w:tcPr/>
+          <w:p>
+            <w:pPr>
+              <w:pStyle w:val="Compact"/>
+              <w:jc w:val="left"/>
+            </w:pPr>
+            <w:r>
               <w:t xml:space="preserve">Targets up to december 2019 only</w:t>
             </w:r>
           </w:p>
@@ -11347,6 +11725,228 @@
               <w:jc w:val="left"/>
             </w:pPr>
             <w:r>
+              <w:t xml:space="preserve">Factor (AR + PCs)</w:t>
+            </w:r>
+          </w:p>
+        </w:tc>
+        <w:tc>
+          <w:tcPr/>
+          <w:p>
+            <w:pPr>
+              <w:pStyle w:val="Compact"/>
+              <w:jc w:val="left"/>
+            </w:pPr>
+            <w:r>
+              <w:t xml:space="preserve">0.97</w:t>
+            </w:r>
+          </w:p>
+        </w:tc>
+        <w:tc>
+          <w:tcPr/>
+          <w:p>
+            <w:pPr>
+              <w:pStyle w:val="Compact"/>
+              <w:jc w:val="left"/>
+            </w:pPr>
+            <w:r>
+              <w:t xml:space="preserve">1.00</w:t>
+            </w:r>
+          </w:p>
+        </w:tc>
+        <w:tc>
+          <w:tcPr/>
+          <w:p>
+            <w:pPr>
+              <w:pStyle w:val="Compact"/>
+              <w:jc w:val="left"/>
+            </w:pPr>
+            <w:r>
+              <w:t xml:space="preserve">0.98</w:t>
+            </w:r>
+          </w:p>
+        </w:tc>
+        <w:tc>
+          <w:tcPr/>
+          <w:p>
+            <w:pPr>
+              <w:pStyle w:val="Compact"/>
+              <w:jc w:val="left"/>
+            </w:pPr>
+            <w:r>
+              <w:t xml:space="preserve">1.01</w:t>
+            </w:r>
+          </w:p>
+        </w:tc>
+      </w:tr>
+      <w:tr>
+        <w:tc>
+          <w:tcPr/>
+          <w:p>
+            <w:pPr>
+              <w:pStyle w:val="Compact"/>
+              <w:jc w:val="left"/>
+            </w:pPr>
+            <w:r>
+              <w:t xml:space="preserve">Targets up to december 2019 only</w:t>
+            </w:r>
+          </w:p>
+        </w:tc>
+        <w:tc>
+          <w:tcPr/>
+          <w:p>
+            <w:pPr>
+              <w:pStyle w:val="Compact"/>
+              <w:jc w:val="left"/>
+            </w:pPr>
+            <w:r>
+              <w:t xml:space="preserve">LASSO</w:t>
+            </w:r>
+          </w:p>
+        </w:tc>
+        <w:tc>
+          <w:tcPr/>
+          <w:p>
+            <w:pPr>
+              <w:pStyle w:val="Compact"/>
+              <w:jc w:val="left"/>
+            </w:pPr>
+            <w:r>
+              <w:t xml:space="preserve">1.03</w:t>
+            </w:r>
+          </w:p>
+        </w:tc>
+        <w:tc>
+          <w:tcPr/>
+          <w:p>
+            <w:pPr>
+              <w:pStyle w:val="Compact"/>
+              <w:jc w:val="left"/>
+            </w:pPr>
+            <w:r>
+              <w:t xml:space="preserve">0.99</w:t>
+            </w:r>
+          </w:p>
+        </w:tc>
+        <w:tc>
+          <w:tcPr/>
+          <w:p>
+            <w:pPr>
+              <w:pStyle w:val="Compact"/>
+              <w:jc w:val="left"/>
+            </w:pPr>
+            <w:r>
+              <w:t xml:space="preserve">1.03</w:t>
+            </w:r>
+          </w:p>
+        </w:tc>
+        <w:tc>
+          <w:tcPr/>
+          <w:p>
+            <w:pPr>
+              <w:pStyle w:val="Compact"/>
+              <w:jc w:val="left"/>
+            </w:pPr>
+            <w:r>
+              <w:t xml:space="preserve">1.03</w:t>
+            </w:r>
+          </w:p>
+        </w:tc>
+      </w:tr>
+      <w:tr>
+        <w:tc>
+          <w:tcPr/>
+          <w:p>
+            <w:pPr>
+              <w:pStyle w:val="Compact"/>
+              <w:jc w:val="left"/>
+            </w:pPr>
+            <w:r>
+              <w:t xml:space="preserve">Targets up to december 2019 only</w:t>
+            </w:r>
+          </w:p>
+        </w:tc>
+        <w:tc>
+          <w:tcPr/>
+          <w:p>
+            <w:pPr>
+              <w:pStyle w:val="Compact"/>
+              <w:jc w:val="left"/>
+            </w:pPr>
+            <w:r>
+              <w:t xml:space="preserve">Random forest</w:t>
+            </w:r>
+          </w:p>
+        </w:tc>
+        <w:tc>
+          <w:tcPr/>
+          <w:p>
+            <w:pPr>
+              <w:pStyle w:val="Compact"/>
+              <w:jc w:val="left"/>
+            </w:pPr>
+            <w:r>
+              <w:t xml:space="preserve">0.98</w:t>
+            </w:r>
+          </w:p>
+        </w:tc>
+        <w:tc>
+          <w:tcPr/>
+          <w:p>
+            <w:pPr>
+              <w:pStyle w:val="Compact"/>
+              <w:jc w:val="left"/>
+            </w:pPr>
+            <w:r>
+              <w:t xml:space="preserve">0.98</w:t>
+            </w:r>
+          </w:p>
+        </w:tc>
+        <w:tc>
+          <w:tcPr/>
+          <w:p>
+            <w:pPr>
+              <w:pStyle w:val="Compact"/>
+              <w:jc w:val="left"/>
+            </w:pPr>
+            <w:r>
+              <w:t xml:space="preserve">1.00</w:t>
+            </w:r>
+          </w:p>
+        </w:tc>
+        <w:tc>
+          <w:tcPr/>
+          <w:p>
+            <w:pPr>
+              <w:pStyle w:val="Compact"/>
+              <w:jc w:val="left"/>
+            </w:pPr>
+            <w:r>
+              <w:t xml:space="preserve">1.09</w:t>
+            </w:r>
+          </w:p>
+        </w:tc>
+      </w:tr>
+      <w:tr>
+        <w:tc>
+          <w:tcPr/>
+          <w:p>
+            <w:pPr>
+              <w:pStyle w:val="Compact"/>
+              <w:jc w:val="left"/>
+            </w:pPr>
+            <w:r>
+              <w:t xml:space="preserve">Targets up to december 2019 only</w:t>
+            </w:r>
+          </w:p>
+        </w:tc>
+        <w:tc>
+          <w:tcPr/>
+          <w:p>
+            <w:pPr>
+              <w:pStyle w:val="Compact"/>
+              <w:jc w:val="left"/>
+            </w:pPr>
+            <w:r>
               <w:t xml:space="preserve">ML combination</w:t>
             </w:r>
           </w:p>
@@ -11396,6 +11996,894 @@
             </w:pPr>
             <w:r>
               <w:t xml:space="preserve">1.07</w:t>
+            </w:r>
+          </w:p>
+        </w:tc>
+      </w:tr>
+      <w:tr>
+        <w:tc>
+          <w:tcPr/>
+          <w:p>
+            <w:pPr>
+              <w:pStyle w:val="Compact"/>
+              <w:jc w:val="left"/>
+            </w:pPr>
+            <w:r>
+              <w:t xml:space="preserve">Only world prices and money as predictors</w:t>
+            </w:r>
+          </w:p>
+        </w:tc>
+        <w:tc>
+          <w:tcPr/>
+          <w:p>
+            <w:pPr>
+              <w:pStyle w:val="Compact"/>
+              <w:jc w:val="left"/>
+            </w:pPr>
+            <w:r>
+              <w:t xml:space="preserve">Factor (AR + PCs)</w:t>
+            </w:r>
+          </w:p>
+        </w:tc>
+        <w:tc>
+          <w:tcPr/>
+          <w:p>
+            <w:pPr>
+              <w:pStyle w:val="Compact"/>
+              <w:jc w:val="left"/>
+            </w:pPr>
+            <w:r>
+              <w:t xml:space="preserve">0.98</w:t>
+            </w:r>
+          </w:p>
+        </w:tc>
+        <w:tc>
+          <w:tcPr/>
+          <w:p>
+            <w:pPr>
+              <w:pStyle w:val="Compact"/>
+              <w:jc w:val="left"/>
+            </w:pPr>
+            <w:r>
+              <w:t xml:space="preserve">1.00</w:t>
+            </w:r>
+          </w:p>
+        </w:tc>
+        <w:tc>
+          <w:tcPr/>
+          <w:p>
+            <w:pPr>
+              <w:pStyle w:val="Compact"/>
+              <w:jc w:val="left"/>
+            </w:pPr>
+            <w:r>
+              <w:t xml:space="preserve">0.99</w:t>
+            </w:r>
+          </w:p>
+        </w:tc>
+        <w:tc>
+          <w:tcPr/>
+          <w:p>
+            <w:pPr>
+              <w:pStyle w:val="Compact"/>
+              <w:jc w:val="left"/>
+            </w:pPr>
+            <w:r>
+              <w:t xml:space="preserve">1.01</w:t>
+            </w:r>
+          </w:p>
+        </w:tc>
+      </w:tr>
+      <w:tr>
+        <w:tc>
+          <w:tcPr/>
+          <w:p>
+            <w:pPr>
+              <w:pStyle w:val="Compact"/>
+              <w:jc w:val="left"/>
+            </w:pPr>
+            <w:r>
+              <w:t xml:space="preserve">Only world prices and money as predictors</w:t>
+            </w:r>
+          </w:p>
+        </w:tc>
+        <w:tc>
+          <w:tcPr/>
+          <w:p>
+            <w:pPr>
+              <w:pStyle w:val="Compact"/>
+              <w:jc w:val="left"/>
+            </w:pPr>
+            <w:r>
+              <w:t xml:space="preserve">LASSO</w:t>
+            </w:r>
+          </w:p>
+        </w:tc>
+        <w:tc>
+          <w:tcPr/>
+          <w:p>
+            <w:pPr>
+              <w:pStyle w:val="Compact"/>
+              <w:jc w:val="left"/>
+            </w:pPr>
+            <w:r>
+              <w:t xml:space="preserve">1.01</w:t>
+            </w:r>
+          </w:p>
+        </w:tc>
+        <w:tc>
+          <w:tcPr/>
+          <w:p>
+            <w:pPr>
+              <w:pStyle w:val="Compact"/>
+              <w:jc w:val="left"/>
+            </w:pPr>
+            <w:r>
+              <w:t xml:space="preserve">1.01</w:t>
+            </w:r>
+          </w:p>
+        </w:tc>
+        <w:tc>
+          <w:tcPr/>
+          <w:p>
+            <w:pPr>
+              <w:pStyle w:val="Compact"/>
+              <w:jc w:val="left"/>
+            </w:pPr>
+            <w:r>
+              <w:t xml:space="preserve">1.00</w:t>
+            </w:r>
+          </w:p>
+        </w:tc>
+        <w:tc>
+          <w:tcPr/>
+          <w:p>
+            <w:pPr>
+              <w:pStyle w:val="Compact"/>
+              <w:jc w:val="left"/>
+            </w:pPr>
+            <w:r>
+              <w:t xml:space="preserve">1.02</w:t>
+            </w:r>
+          </w:p>
+        </w:tc>
+      </w:tr>
+      <w:tr>
+        <w:tc>
+          <w:tcPr/>
+          <w:p>
+            <w:pPr>
+              <w:pStyle w:val="Compact"/>
+              <w:jc w:val="left"/>
+            </w:pPr>
+            <w:r>
+              <w:t xml:space="preserve">Only world prices and money as predictors</w:t>
+            </w:r>
+          </w:p>
+        </w:tc>
+        <w:tc>
+          <w:tcPr/>
+          <w:p>
+            <w:pPr>
+              <w:pStyle w:val="Compact"/>
+              <w:jc w:val="left"/>
+            </w:pPr>
+            <w:r>
+              <w:t xml:space="preserve">Random forest</w:t>
+            </w:r>
+          </w:p>
+        </w:tc>
+        <w:tc>
+          <w:tcPr/>
+          <w:p>
+            <w:pPr>
+              <w:pStyle w:val="Compact"/>
+              <w:jc w:val="left"/>
+            </w:pPr>
+            <w:r>
+              <w:t xml:space="preserve">0.99</w:t>
+            </w:r>
+          </w:p>
+        </w:tc>
+        <w:tc>
+          <w:tcPr/>
+          <w:p>
+            <w:pPr>
+              <w:pStyle w:val="Compact"/>
+              <w:jc w:val="left"/>
+            </w:pPr>
+            <w:r>
+              <w:t xml:space="preserve">1.05</w:t>
+            </w:r>
+          </w:p>
+        </w:tc>
+        <w:tc>
+          <w:tcPr/>
+          <w:p>
+            <w:pPr>
+              <w:pStyle w:val="Compact"/>
+              <w:jc w:val="left"/>
+            </w:pPr>
+            <w:r>
+              <w:t xml:space="preserve">1.01</w:t>
+            </w:r>
+          </w:p>
+        </w:tc>
+        <w:tc>
+          <w:tcPr/>
+          <w:p>
+            <w:pPr>
+              <w:pStyle w:val="Compact"/>
+              <w:jc w:val="left"/>
+            </w:pPr>
+            <w:r>
+              <w:t xml:space="preserve">1.07</w:t>
+            </w:r>
+          </w:p>
+        </w:tc>
+      </w:tr>
+      <w:tr>
+        <w:tc>
+          <w:tcPr/>
+          <w:p>
+            <w:pPr>
+              <w:pStyle w:val="Compact"/>
+              <w:jc w:val="left"/>
+            </w:pPr>
+            <w:r>
+              <w:t xml:space="preserve">Only world prices and money as predictors</w:t>
+            </w:r>
+          </w:p>
+        </w:tc>
+        <w:tc>
+          <w:tcPr/>
+          <w:p>
+            <w:pPr>
+              <w:pStyle w:val="Compact"/>
+              <w:jc w:val="left"/>
+            </w:pPr>
+            <w:r>
+              <w:t xml:space="preserve">ML combination</w:t>
+            </w:r>
+          </w:p>
+        </w:tc>
+        <w:tc>
+          <w:tcPr/>
+          <w:p>
+            <w:pPr>
+              <w:pStyle w:val="Compact"/>
+              <w:jc w:val="left"/>
+            </w:pPr>
+            <w:r>
+              <w:t xml:space="preserve">0.97</w:t>
+            </w:r>
+          </w:p>
+        </w:tc>
+        <w:tc>
+          <w:tcPr/>
+          <w:p>
+            <w:pPr>
+              <w:pStyle w:val="Compact"/>
+              <w:jc w:val="left"/>
+            </w:pPr>
+            <w:r>
+              <w:t xml:space="preserve">1.04</w:t>
+            </w:r>
+          </w:p>
+        </w:tc>
+        <w:tc>
+          <w:tcPr/>
+          <w:p>
+            <w:pPr>
+              <w:pStyle w:val="Compact"/>
+              <w:jc w:val="left"/>
+            </w:pPr>
+            <w:r>
+              <w:t xml:space="preserve">1.00</w:t>
+            </w:r>
+          </w:p>
+        </w:tc>
+        <w:tc>
+          <w:tcPr/>
+          <w:p>
+            <w:pPr>
+              <w:pStyle w:val="Compact"/>
+              <w:jc w:val="left"/>
+            </w:pPr>
+            <w:r>
+              <w:t xml:space="preserve">1.05</w:t>
+            </w:r>
+          </w:p>
+        </w:tc>
+      </w:tr>
+      <w:tr>
+        <w:tc>
+          <w:tcPr/>
+          <w:p>
+            <w:pPr>
+              <w:pStyle w:val="Compact"/>
+              <w:jc w:val="left"/>
+            </w:pPr>
+            <w:r>
+              <w:t xml:space="preserve">A dummy for the january 2018 join</w:t>
+            </w:r>
+          </w:p>
+        </w:tc>
+        <w:tc>
+          <w:tcPr/>
+          <w:p>
+            <w:pPr>
+              <w:pStyle w:val="Compact"/>
+              <w:jc w:val="left"/>
+            </w:pPr>
+            <w:r>
+              <w:t xml:space="preserve">Factor (AR + PCs)</w:t>
+            </w:r>
+          </w:p>
+        </w:tc>
+        <w:tc>
+          <w:tcPr/>
+          <w:p>
+            <w:pPr>
+              <w:pStyle w:val="Compact"/>
+              <w:jc w:val="left"/>
+            </w:pPr>
+            <w:r>
+              <w:t xml:space="preserve">0.99</w:t>
+            </w:r>
+          </w:p>
+        </w:tc>
+        <w:tc>
+          <w:tcPr/>
+          <w:p>
+            <w:pPr>
+              <w:pStyle w:val="Compact"/>
+              <w:jc w:val="left"/>
+            </w:pPr>
+            <w:r>
+              <w:t xml:space="preserve">1.00</w:t>
+            </w:r>
+          </w:p>
+        </w:tc>
+        <w:tc>
+          <w:tcPr/>
+          <w:p>
+            <w:pPr>
+              <w:pStyle w:val="Compact"/>
+              <w:jc w:val="left"/>
+            </w:pPr>
+            <w:r>
+              <w:t xml:space="preserve">0.99</w:t>
+            </w:r>
+          </w:p>
+        </w:tc>
+        <w:tc>
+          <w:tcPr/>
+          <w:p>
+            <w:pPr>
+              <w:pStyle w:val="Compact"/>
+              <w:jc w:val="left"/>
+            </w:pPr>
+            <w:r>
+              <w:t xml:space="preserve">1.00</w:t>
+            </w:r>
+          </w:p>
+        </w:tc>
+      </w:tr>
+      <w:tr>
+        <w:tc>
+          <w:tcPr/>
+          <w:p>
+            <w:pPr>
+              <w:pStyle w:val="Compact"/>
+              <w:jc w:val="left"/>
+            </w:pPr>
+            <w:r>
+              <w:t xml:space="preserve">A dummy for the january 2018 join</w:t>
+            </w:r>
+          </w:p>
+        </w:tc>
+        <w:tc>
+          <w:tcPr/>
+          <w:p>
+            <w:pPr>
+              <w:pStyle w:val="Compact"/>
+              <w:jc w:val="left"/>
+            </w:pPr>
+            <w:r>
+              <w:t xml:space="preserve">LASSO</w:t>
+            </w:r>
+          </w:p>
+        </w:tc>
+        <w:tc>
+          <w:tcPr/>
+          <w:p>
+            <w:pPr>
+              <w:pStyle w:val="Compact"/>
+              <w:jc w:val="left"/>
+            </w:pPr>
+            <w:r>
+              <w:t xml:space="preserve">1.01</w:t>
+            </w:r>
+          </w:p>
+        </w:tc>
+        <w:tc>
+          <w:tcPr/>
+          <w:p>
+            <w:pPr>
+              <w:pStyle w:val="Compact"/>
+              <w:jc w:val="left"/>
+            </w:pPr>
+            <w:r>
+              <w:t xml:space="preserve">1.01</w:t>
+            </w:r>
+          </w:p>
+        </w:tc>
+        <w:tc>
+          <w:tcPr/>
+          <w:p>
+            <w:pPr>
+              <w:pStyle w:val="Compact"/>
+              <w:jc w:val="left"/>
+            </w:pPr>
+            <w:r>
+              <w:t xml:space="preserve">0.99</w:t>
+            </w:r>
+          </w:p>
+        </w:tc>
+        <w:tc>
+          <w:tcPr/>
+          <w:p>
+            <w:pPr>
+              <w:pStyle w:val="Compact"/>
+              <w:jc w:val="left"/>
+            </w:pPr>
+            <w:r>
+              <w:t xml:space="preserve">1.01</w:t>
+            </w:r>
+          </w:p>
+        </w:tc>
+      </w:tr>
+      <w:tr>
+        <w:tc>
+          <w:tcPr/>
+          <w:p>
+            <w:pPr>
+              <w:pStyle w:val="Compact"/>
+              <w:jc w:val="left"/>
+            </w:pPr>
+            <w:r>
+              <w:t xml:space="preserve">A dummy for the january 2018 join</w:t>
+            </w:r>
+          </w:p>
+        </w:tc>
+        <w:tc>
+          <w:tcPr/>
+          <w:p>
+            <w:pPr>
+              <w:pStyle w:val="Compact"/>
+              <w:jc w:val="left"/>
+            </w:pPr>
+            <w:r>
+              <w:t xml:space="preserve">Random forest</w:t>
+            </w:r>
+          </w:p>
+        </w:tc>
+        <w:tc>
+          <w:tcPr/>
+          <w:p>
+            <w:pPr>
+              <w:pStyle w:val="Compact"/>
+              <w:jc w:val="left"/>
+            </w:pPr>
+            <w:r>
+              <w:t xml:space="preserve">1.00</w:t>
+            </w:r>
+          </w:p>
+        </w:tc>
+        <w:tc>
+          <w:tcPr/>
+          <w:p>
+            <w:pPr>
+              <w:pStyle w:val="Compact"/>
+              <w:jc w:val="left"/>
+            </w:pPr>
+            <w:r>
+              <w:t xml:space="preserve">1.01</w:t>
+            </w:r>
+          </w:p>
+        </w:tc>
+        <w:tc>
+          <w:tcPr/>
+          <w:p>
+            <w:pPr>
+              <w:pStyle w:val="Compact"/>
+              <w:jc w:val="left"/>
+            </w:pPr>
+            <w:r>
+              <w:t xml:space="preserve">0.99</w:t>
+            </w:r>
+          </w:p>
+        </w:tc>
+        <w:tc>
+          <w:tcPr/>
+          <w:p>
+            <w:pPr>
+              <w:pStyle w:val="Compact"/>
+              <w:jc w:val="left"/>
+            </w:pPr>
+            <w:r>
+              <w:t xml:space="preserve">1.03</w:t>
+            </w:r>
+          </w:p>
+        </w:tc>
+      </w:tr>
+      <w:tr>
+        <w:tc>
+          <w:tcPr/>
+          <w:p>
+            <w:pPr>
+              <w:pStyle w:val="Compact"/>
+              <w:jc w:val="left"/>
+            </w:pPr>
+            <w:r>
+              <w:t xml:space="preserve">A dummy for the january 2018 join</w:t>
+            </w:r>
+          </w:p>
+        </w:tc>
+        <w:tc>
+          <w:tcPr/>
+          <w:p>
+            <w:pPr>
+              <w:pStyle w:val="Compact"/>
+              <w:jc w:val="left"/>
+            </w:pPr>
+            <w:r>
+              <w:t xml:space="preserve">ML combination</w:t>
+            </w:r>
+          </w:p>
+        </w:tc>
+        <w:tc>
+          <w:tcPr/>
+          <w:p>
+            <w:pPr>
+              <w:pStyle w:val="Compact"/>
+              <w:jc w:val="left"/>
+            </w:pPr>
+            <w:r>
+              <w:t xml:space="preserve">0.99</w:t>
+            </w:r>
+          </w:p>
+        </w:tc>
+        <w:tc>
+          <w:tcPr/>
+          <w:p>
+            <w:pPr>
+              <w:pStyle w:val="Compact"/>
+              <w:jc w:val="left"/>
+            </w:pPr>
+            <w:r>
+              <w:t xml:space="preserve">1.01</w:t>
+            </w:r>
+          </w:p>
+        </w:tc>
+        <w:tc>
+          <w:tcPr/>
+          <w:p>
+            <w:pPr>
+              <w:pStyle w:val="Compact"/>
+              <w:jc w:val="left"/>
+            </w:pPr>
+            <w:r>
+              <w:t xml:space="preserve">0.98</w:t>
+            </w:r>
+          </w:p>
+        </w:tc>
+        <w:tc>
+          <w:tcPr/>
+          <w:p>
+            <w:pPr>
+              <w:pStyle w:val="Compact"/>
+              <w:jc w:val="left"/>
+            </w:pPr>
+            <w:r>
+              <w:t xml:space="preserve">1.03</w:t>
+            </w:r>
+          </w:p>
+        </w:tc>
+      </w:tr>
+      <w:tr>
+        <w:tc>
+          <w:tcPr/>
+          <w:p>
+            <w:pPr>
+              <w:pStyle w:val="Compact"/>
+              <w:jc w:val="left"/>
+            </w:pPr>
+            <w:r>
+              <w:t xml:space="preserve">Core inflation as the target</w:t>
+            </w:r>
+          </w:p>
+        </w:tc>
+        <w:tc>
+          <w:tcPr/>
+          <w:p>
+            <w:pPr>
+              <w:pStyle w:val="Compact"/>
+              <w:jc w:val="left"/>
+            </w:pPr>
+            <w:r>
+              <w:t xml:space="preserve">Factor (AR + PCs)</w:t>
+            </w:r>
+          </w:p>
+        </w:tc>
+        <w:tc>
+          <w:tcPr/>
+          <w:p>
+            <w:pPr>
+              <w:pStyle w:val="Compact"/>
+              <w:jc w:val="left"/>
+            </w:pPr>
+            <w:r>
+              <w:t xml:space="preserve">0.99</w:t>
+            </w:r>
+          </w:p>
+        </w:tc>
+        <w:tc>
+          <w:tcPr/>
+          <w:p>
+            <w:pPr>
+              <w:pStyle w:val="Compact"/>
+              <w:jc w:val="left"/>
+            </w:pPr>
+            <w:r>
+              <w:t xml:space="preserve">1.04</w:t>
+            </w:r>
+          </w:p>
+        </w:tc>
+        <w:tc>
+          <w:tcPr/>
+          <w:p>
+            <w:pPr>
+              <w:pStyle w:val="Compact"/>
+              <w:jc w:val="left"/>
+            </w:pPr>
+            <w:r>
+              <w:t xml:space="preserve">0.98</w:t>
+            </w:r>
+          </w:p>
+        </w:tc>
+        <w:tc>
+          <w:tcPr/>
+          <w:p>
+            <w:pPr>
+              <w:pStyle w:val="Compact"/>
+              <w:jc w:val="left"/>
+            </w:pPr>
+            <w:r>
+              <w:t xml:space="preserve">1.00</w:t>
+            </w:r>
+          </w:p>
+        </w:tc>
+      </w:tr>
+      <w:tr>
+        <w:tc>
+          <w:tcPr/>
+          <w:p>
+            <w:pPr>
+              <w:pStyle w:val="Compact"/>
+              <w:jc w:val="left"/>
+            </w:pPr>
+            <w:r>
+              <w:t xml:space="preserve">Core inflation as the target</w:t>
+            </w:r>
+          </w:p>
+        </w:tc>
+        <w:tc>
+          <w:tcPr/>
+          <w:p>
+            <w:pPr>
+              <w:pStyle w:val="Compact"/>
+              <w:jc w:val="left"/>
+            </w:pPr>
+            <w:r>
+              <w:t xml:space="preserve">LASSO</w:t>
+            </w:r>
+          </w:p>
+        </w:tc>
+        <w:tc>
+          <w:tcPr/>
+          <w:p>
+            <w:pPr>
+              <w:pStyle w:val="Compact"/>
+              <w:jc w:val="left"/>
+            </w:pPr>
+            <w:r>
+              <w:t xml:space="preserve">1.01</w:t>
+            </w:r>
+          </w:p>
+        </w:tc>
+        <w:tc>
+          <w:tcPr/>
+          <w:p>
+            <w:pPr>
+              <w:pStyle w:val="Compact"/>
+              <w:jc w:val="left"/>
+            </w:pPr>
+            <w:r>
+              <w:t xml:space="preserve">1.00</w:t>
+            </w:r>
+          </w:p>
+        </w:tc>
+        <w:tc>
+          <w:tcPr/>
+          <w:p>
+            <w:pPr>
+              <w:pStyle w:val="Compact"/>
+              <w:jc w:val="left"/>
+            </w:pPr>
+            <w:r>
+              <w:t xml:space="preserve">1.02</w:t>
+            </w:r>
+          </w:p>
+        </w:tc>
+        <w:tc>
+          <w:tcPr/>
+          <w:p>
+            <w:pPr>
+              <w:pStyle w:val="Compact"/>
+              <w:jc w:val="left"/>
+            </w:pPr>
+            <w:r>
+              <w:t xml:space="preserve">1.00</w:t>
+            </w:r>
+          </w:p>
+        </w:tc>
+      </w:tr>
+      <w:tr>
+        <w:tc>
+          <w:tcPr/>
+          <w:p>
+            <w:pPr>
+              <w:pStyle w:val="Compact"/>
+              <w:jc w:val="left"/>
+            </w:pPr>
+            <w:r>
+              <w:t xml:space="preserve">Core inflation as the target</w:t>
+            </w:r>
+          </w:p>
+        </w:tc>
+        <w:tc>
+          <w:tcPr/>
+          <w:p>
+            <w:pPr>
+              <w:pStyle w:val="Compact"/>
+              <w:jc w:val="left"/>
+            </w:pPr>
+            <w:r>
+              <w:t xml:space="preserve">Random forest</w:t>
+            </w:r>
+          </w:p>
+        </w:tc>
+        <w:tc>
+          <w:tcPr/>
+          <w:p>
+            <w:pPr>
+              <w:pStyle w:val="Compact"/>
+              <w:jc w:val="left"/>
+            </w:pPr>
+            <w:r>
+              <w:t xml:space="preserve">0.95</w:t>
+            </w:r>
+          </w:p>
+        </w:tc>
+        <w:tc>
+          <w:tcPr/>
+          <w:p>
+            <w:pPr>
+              <w:pStyle w:val="Compact"/>
+              <w:jc w:val="left"/>
+            </w:pPr>
+            <w:r>
+              <w:t xml:space="preserve">1.01</w:t>
+            </w:r>
+          </w:p>
+        </w:tc>
+        <w:tc>
+          <w:tcPr/>
+          <w:p>
+            <w:pPr>
+              <w:pStyle w:val="Compact"/>
+              <w:jc w:val="left"/>
+            </w:pPr>
+            <w:r>
+              <w:t xml:space="preserve">0.94</w:t>
+            </w:r>
+          </w:p>
+        </w:tc>
+        <w:tc>
+          <w:tcPr/>
+          <w:p>
+            <w:pPr>
+              <w:pStyle w:val="Compact"/>
+              <w:jc w:val="left"/>
+            </w:pPr>
+            <w:r>
+              <w:t xml:space="preserve">1.00</w:t>
+            </w:r>
+          </w:p>
+        </w:tc>
+      </w:tr>
+      <w:tr>
+        <w:tc>
+          <w:tcPr/>
+          <w:p>
+            <w:pPr>
+              <w:pStyle w:val="Compact"/>
+              <w:jc w:val="left"/>
+            </w:pPr>
+            <w:r>
+              <w:t xml:space="preserve">Core inflation as the target</w:t>
+            </w:r>
+          </w:p>
+        </w:tc>
+        <w:tc>
+          <w:tcPr/>
+          <w:p>
+            <w:pPr>
+              <w:pStyle w:val="Compact"/>
+              <w:jc w:val="left"/>
+            </w:pPr>
+            <w:r>
+              <w:t xml:space="preserve">ML combination</w:t>
+            </w:r>
+          </w:p>
+        </w:tc>
+        <w:tc>
+          <w:tcPr/>
+          <w:p>
+            <w:pPr>
+              <w:pStyle w:val="Compact"/>
+              <w:jc w:val="left"/>
+            </w:pPr>
+            <w:r>
+              <w:t xml:space="preserve">0.95</w:t>
+            </w:r>
+          </w:p>
+        </w:tc>
+        <w:tc>
+          <w:tcPr/>
+          <w:p>
+            <w:pPr>
+              <w:pStyle w:val="Compact"/>
+              <w:jc w:val="left"/>
+            </w:pPr>
+            <w:r>
+              <w:t xml:space="preserve">0.99</w:t>
+            </w:r>
+          </w:p>
+        </w:tc>
+        <w:tc>
+          <w:tcPr/>
+          <w:p>
+            <w:pPr>
+              <w:pStyle w:val="Compact"/>
+              <w:jc w:val="left"/>
+            </w:pPr>
+            <w:r>
+              <w:t xml:space="preserve">0.94*</w:t>
+            </w:r>
+          </w:p>
+        </w:tc>
+        <w:tc>
+          <w:tcPr/>
+          <w:p>
+            <w:pPr>
+              <w:pStyle w:val="Compact"/>
+              <w:jc w:val="left"/>
+            </w:pPr>
+            <w:r>
+              <w:t xml:space="preserve">0.98</w:t>
             </w:r>
           </w:p>
         </w:tc>
@@ -11656,7 +13144,7 @@
       <w:r>
         <w:drawing>
           <wp:inline>
-            <wp:extent cx="5334000" cy="2364790"/>
+            <wp:extent cx="5334000" cy="2647757"/>
             <wp:effectExtent b="0" l="0" r="0" t="0"/>
             <wp:docPr descr="RMSE relative to the AR at the four decisive cases, for the random forest (filled circles) and the ML combination (open squares), in the main specification and each robustness check. Values left of the vertical line mean the model is more accurate than the AR." title="" id="89" name="Picture"/>
             <a:graphic>
@@ -11677,7 +13165,7 @@
                   <pic:spPr bwMode="auto">
                     <a:xfrm>
                       <a:off x="0" y="0"/>
-                      <a:ext cx="5334000" cy="2364790"/>
+                      <a:ext cx="5334000" cy="2647757"/>
                     </a:xfrm>
                     <a:prstGeom prst="rect">
                       <a:avLst/>

</xml_diff>

<commit_message>
Target Journal of Asian Economics: author details, Asian framing, highlights, cover letter, checklist (D14)
Co-Authored-By: Claude Opus 5.5 <noreply@anthropic.com>
Claude-Session: https://claude.ai/code/session_016n4FdkJhh6GyuBxjTAwoWb
</commit_message>
<xml_diff>
--- a/paper/manuscript.docx
+++ b/paper/manuscript.docx
@@ -137,6 +137,79 @@
         <w:pStyle w:val="Date"/>
       </w:pPr>
       <w:r>
+        <w:t xml:space="preserve">Submitted</w:t>
+      </w:r>
+      <w:r>
+        <w:t xml:space="preserve"> </w:t>
+      </w:r>
+      <w:r>
+        <w:t xml:space="preserve">to</w:t>
+      </w:r>
+      <w:r>
+        <w:t xml:space="preserve"> </w:t>
+      </w:r>
+      <w:r>
+        <w:t xml:space="preserve">the</w:t>
+      </w:r>
+      <w:r>
+        <w:t xml:space="preserve"> </w:t>
+      </w:r>
+      <w:r>
+        <w:rPr>
+          <w:iCs/>
+          <w:i/>
+        </w:rPr>
+        <w:t xml:space="preserve">Journal</w:t>
+      </w:r>
+      <w:r>
+        <w:rPr>
+          <w:iCs/>
+          <w:i/>
+        </w:rPr>
+        <w:t xml:space="preserve"> </w:t>
+      </w:r>
+      <w:r>
+        <w:rPr>
+          <w:iCs/>
+          <w:i/>
+        </w:rPr>
+        <w:t xml:space="preserve">of</w:t>
+      </w:r>
+      <w:r>
+        <w:rPr>
+          <w:iCs/>
+          <w:i/>
+        </w:rPr>
+        <w:t xml:space="preserve"> </w:t>
+      </w:r>
+      <w:r>
+        <w:rPr>
+          <w:iCs/>
+          <w:i/>
+        </w:rPr>
+        <w:t xml:space="preserve">Asian</w:t>
+      </w:r>
+      <w:r>
+        <w:rPr>
+          <w:iCs/>
+          <w:i/>
+        </w:rPr>
+        <w:t xml:space="preserve"> </w:t>
+      </w:r>
+      <w:r>
+        <w:rPr>
+          <w:iCs/>
+          <w:i/>
+        </w:rPr>
+        <w:t xml:space="preserve">Economics</w:t>
+      </w:r>
+      <w:r>
+        <w:t xml:space="preserve">.</w:t>
+      </w:r>
+      <w:r>
+        <w:t xml:space="preserve"> </w:t>
+      </w:r>
+      <w:r>
         <w:t xml:space="preserve">Draft</w:t>
       </w:r>
       <w:r>
@@ -1715,7 +1788,31 @@
         <w:t xml:space="preserve"> </w:t>
       </w:r>
       <w:r>
-        <w:t xml:space="preserve">it to 7.2% in September 2026.</w:t>
+        <w:t xml:space="preserve">it to 7.2% in September 2026. These features are common</w:t>
+      </w:r>
+      <w:r>
+        <w:t xml:space="preserve"> </w:t>
+      </w:r>
+      <w:r>
+        <w:t xml:space="preserve">across emerging Asia: rice is the staple, food takes a large share of household</w:t>
+      </w:r>
+      <w:r>
+        <w:t xml:space="preserve"> </w:t>
+      </w:r>
+      <w:r>
+        <w:t xml:space="preserve">budgets, and most economies import their oil. The Philippine evidence is</w:t>
+      </w:r>
+      <w:r>
+        <w:t xml:space="preserve"> </w:t>
+      </w:r>
+      <w:r>
+        <w:t xml:space="preserve">therefore a useful test case for other Asian central banks that are weighing</w:t>
+      </w:r>
+      <w:r>
+        <w:t xml:space="preserve"> </w:t>
+      </w:r>
+      <w:r>
+        <w:t xml:space="preserve">whether to add ML tools to their forecasting toolkits.</w:t>
       </w:r>
     </w:p>
     <w:p>
@@ -8649,7 +8746,25 @@
         <w:t xml:space="preserve"> </w:t>
       </w:r>
       <w:r>
-        <w:t xml:space="preserve">observe.</w:t>
+        <w:t xml:space="preserve">observe. The replication gate is qualitative. It checks that our code</w:t>
+      </w:r>
+      <w:r>
+        <w:t xml:space="preserve"> </w:t>
+      </w:r>
+      <w:r>
+        <w:t xml:space="preserve">reproduces the reference paper’s rankings and its random-forest advantage on US</w:t>
+      </w:r>
+      <w:r>
+        <w:t xml:space="preserve"> </w:t>
+      </w:r>
+      <w:r>
+        <w:t xml:space="preserve">data, not its exact numbers, which we could not access when the gate was</w:t>
+      </w:r>
+      <w:r>
+        <w:t xml:space="preserve"> </w:t>
+      </w:r>
+      <w:r>
+        <w:t xml:space="preserve">written.</w:t>
       </w:r>
     </w:p>
     <w:bookmarkEnd w:id="33"/>
@@ -17045,25 +17160,55 @@
         <w:t xml:space="preserve"> </w:t>
       </w:r>
       <w:r>
-        <w:t xml:space="preserve">[Affiliation].</w:t>
-      </w:r>
-      <w:r>
-        <w:t xml:space="preserve"> </w:t>
-      </w:r>
-      <w:r>
-        <w:t xml:space="preserve">Contact:</w:t>
-      </w:r>
-      <w:r>
-        <w:t xml:space="preserve"> </w:t>
-      </w:r>
-      <w:r>
-        <w:t xml:space="preserve">[e-mail].</w:t>
-      </w:r>
-      <w:r>
-        <w:t xml:space="preserve"> </w:t>
-      </w:r>
-      <w:r>
-        <w:t xml:space="preserve">[Acknowledgements.]</w:t>
+        <w:t xml:space="preserve">University</w:t>
+      </w:r>
+      <w:r>
+        <w:t xml:space="preserve"> </w:t>
+      </w:r>
+      <w:r>
+        <w:t xml:space="preserve">of</w:t>
+      </w:r>
+      <w:r>
+        <w:t xml:space="preserve"> </w:t>
+      </w:r>
+      <w:r>
+        <w:t xml:space="preserve">Southeastern</w:t>
+      </w:r>
+      <w:r>
+        <w:t xml:space="preserve"> </w:t>
+      </w:r>
+      <w:r>
+        <w:t xml:space="preserve">Philippines,</w:t>
+      </w:r>
+      <w:r>
+        <w:t xml:space="preserve"> </w:t>
+      </w:r>
+      <w:r>
+        <w:t xml:space="preserve">Davao</w:t>
+      </w:r>
+      <w:r>
+        <w:t xml:space="preserve"> </w:t>
+      </w:r>
+      <w:r>
+        <w:t xml:space="preserve">City,</w:t>
+      </w:r>
+      <w:r>
+        <w:t xml:space="preserve"> </w:t>
+      </w:r>
+      <w:r>
+        <w:t xml:space="preserve">Philippines.</w:t>
+      </w:r>
+      <w:r>
+        <w:t xml:space="preserve"> </w:t>
+      </w:r>
+      <w:r>
+        <w:t xml:space="preserve">E-mail:</w:t>
+      </w:r>
+      <w:r>
+        <w:t xml:space="preserve"> </w:t>
+      </w:r>
+      <w:r>
+        <w:t xml:space="preserve">lrcataytay00745@usep.edu.ph.</w:t>
       </w:r>
     </w:p>
   </w:footnote>

</xml_diff>